<commit_message>
Module 3 - Gestion des séances
</commit_message>
<xml_diff>
--- a/Projet 1- Plateforme de réservation de billets de cinéma.docx
+++ b/Projet 1- Plateforme de réservation de billets de cinéma.docx
@@ -197,13 +197,8 @@
           <w:numId w:val="2"/>
         </w:numPr>
       </w:pPr>
-      <w:proofErr w:type="gramStart"/>
-      <w:r>
-        <w:t>publier</w:t>
-      </w:r>
-      <w:proofErr w:type="gramEnd"/>
-      <w:r>
-        <w:t xml:space="preserve"> leur programmation</w:t>
+      <w:r>
+        <w:t>publier leur programmation</w:t>
       </w:r>
     </w:p>
     <w:p>
@@ -213,13 +208,8 @@
           <w:numId w:val="2"/>
         </w:numPr>
       </w:pPr>
-      <w:proofErr w:type="gramStart"/>
-      <w:r>
-        <w:t>afficher</w:t>
-      </w:r>
-      <w:proofErr w:type="gramEnd"/>
-      <w:r>
-        <w:t xml:space="preserve"> les places disponibles</w:t>
+      <w:r>
+        <w:t>afficher les places disponibles</w:t>
       </w:r>
     </w:p>
     <w:p>
@@ -229,13 +219,8 @@
           <w:numId w:val="2"/>
         </w:numPr>
       </w:pPr>
-      <w:proofErr w:type="gramStart"/>
-      <w:r>
-        <w:t>permettre</w:t>
-      </w:r>
-      <w:proofErr w:type="gramEnd"/>
-      <w:r>
-        <w:t xml:space="preserve"> la réservation en ligne</w:t>
+      <w:r>
+        <w:t>permettre la réservation en ligne</w:t>
       </w:r>
     </w:p>
     <w:p>
@@ -245,13 +230,8 @@
           <w:numId w:val="2"/>
         </w:numPr>
       </w:pPr>
-      <w:proofErr w:type="gramStart"/>
-      <w:r>
-        <w:t>éviter</w:t>
-      </w:r>
-      <w:proofErr w:type="gramEnd"/>
-      <w:r>
-        <w:t xml:space="preserve"> les doubles réservations</w:t>
+      <w:r>
+        <w:t>éviter les doubles réservations</w:t>
       </w:r>
     </w:p>
     <w:p>
@@ -261,13 +241,8 @@
           <w:numId w:val="2"/>
         </w:numPr>
       </w:pPr>
-      <w:proofErr w:type="gramStart"/>
-      <w:r>
-        <w:t>suivre</w:t>
-      </w:r>
-      <w:proofErr w:type="gramEnd"/>
-      <w:r>
-        <w:t xml:space="preserve"> les achats et réservations</w:t>
+      <w:r>
+        <w:t>suivre les achats et réservations</w:t>
       </w:r>
     </w:p>
     <w:p>
@@ -355,13 +330,8 @@
           <w:numId w:val="4"/>
         </w:numPr>
       </w:pPr>
-      <w:proofErr w:type="gramStart"/>
-      <w:r>
-        <w:t>créer</w:t>
-      </w:r>
-      <w:proofErr w:type="gramEnd"/>
-      <w:r>
-        <w:t xml:space="preserve"> un compte / se connecter</w:t>
+      <w:r>
+        <w:t>créer un compte / se connecter</w:t>
       </w:r>
     </w:p>
     <w:p>
@@ -371,13 +341,8 @@
           <w:numId w:val="4"/>
         </w:numPr>
       </w:pPr>
-      <w:proofErr w:type="gramStart"/>
-      <w:r>
-        <w:t>consulter</w:t>
-      </w:r>
-      <w:proofErr w:type="gramEnd"/>
-      <w:r>
-        <w:t xml:space="preserve"> la liste des films</w:t>
+      <w:r>
+        <w:t>consulter la liste des films</w:t>
       </w:r>
     </w:p>
     <w:p>
@@ -387,13 +352,8 @@
           <w:numId w:val="4"/>
         </w:numPr>
       </w:pPr>
-      <w:proofErr w:type="gramStart"/>
-      <w:r>
-        <w:t>voir</w:t>
-      </w:r>
-      <w:proofErr w:type="gramEnd"/>
-      <w:r>
-        <w:t xml:space="preserve"> les détails d’un film</w:t>
+      <w:r>
+        <w:t>voir les détails d’un film</w:t>
       </w:r>
     </w:p>
     <w:p>
@@ -403,14 +363,9 @@
           <w:numId w:val="4"/>
         </w:numPr>
       </w:pPr>
-      <w:proofErr w:type="gramStart"/>
       <w:r>
         <w:lastRenderedPageBreak/>
-        <w:t>consulter</w:t>
-      </w:r>
-      <w:proofErr w:type="gramEnd"/>
-      <w:r>
-        <w:t xml:space="preserve"> les séances disponibles</w:t>
+        <w:t>consulter les séances disponibles</w:t>
       </w:r>
     </w:p>
     <w:p>
@@ -420,13 +375,8 @@
           <w:numId w:val="4"/>
         </w:numPr>
       </w:pPr>
-      <w:proofErr w:type="gramStart"/>
-      <w:r>
-        <w:t>choisir</w:t>
-      </w:r>
-      <w:proofErr w:type="gramEnd"/>
-      <w:r>
-        <w:t xml:space="preserve"> une salle et une séance</w:t>
+      <w:r>
+        <w:t>choisir une salle et une séance</w:t>
       </w:r>
     </w:p>
     <w:p>
@@ -436,13 +386,8 @@
           <w:numId w:val="4"/>
         </w:numPr>
       </w:pPr>
-      <w:proofErr w:type="gramStart"/>
-      <w:r>
-        <w:t>sélectionner</w:t>
-      </w:r>
-      <w:proofErr w:type="gramEnd"/>
-      <w:r>
-        <w:t xml:space="preserve"> une ou plusieurs places</w:t>
+      <w:r>
+        <w:t>sélectionner une ou plusieurs places</w:t>
       </w:r>
     </w:p>
     <w:p>
@@ -452,13 +397,8 @@
           <w:numId w:val="4"/>
         </w:numPr>
       </w:pPr>
-      <w:proofErr w:type="gramStart"/>
-      <w:r>
-        <w:t>confirmer</w:t>
-      </w:r>
-      <w:proofErr w:type="gramEnd"/>
-      <w:r>
-        <w:t xml:space="preserve"> une réservation</w:t>
+      <w:r>
+        <w:t>confirmer une réservation</w:t>
       </w:r>
     </w:p>
     <w:p>
@@ -468,13 +408,8 @@
           <w:numId w:val="4"/>
         </w:numPr>
       </w:pPr>
-      <w:proofErr w:type="gramStart"/>
-      <w:r>
-        <w:t>simuler</w:t>
-      </w:r>
-      <w:proofErr w:type="gramEnd"/>
-      <w:r>
-        <w:t xml:space="preserve"> un paiement</w:t>
+      <w:r>
+        <w:t>simuler un paiement</w:t>
       </w:r>
     </w:p>
     <w:p>
@@ -484,13 +419,8 @@
           <w:numId w:val="4"/>
         </w:numPr>
       </w:pPr>
-      <w:proofErr w:type="gramStart"/>
-      <w:r>
-        <w:t>télécharger</w:t>
-      </w:r>
-      <w:proofErr w:type="gramEnd"/>
-      <w:r>
-        <w:t xml:space="preserve"> ou consulter un billet</w:t>
+      <w:r>
+        <w:t>télécharger ou consulter un billet</w:t>
       </w:r>
     </w:p>
     <w:p>
@@ -500,13 +430,8 @@
           <w:numId w:val="4"/>
         </w:numPr>
       </w:pPr>
-      <w:proofErr w:type="gramStart"/>
-      <w:r>
-        <w:t>consulter</w:t>
-      </w:r>
-      <w:proofErr w:type="gramEnd"/>
-      <w:r>
-        <w:t xml:space="preserve"> l’historique</w:t>
+      <w:r>
+        <w:t>consulter l’historique</w:t>
       </w:r>
     </w:p>
     <w:p>
@@ -516,13 +441,8 @@
           <w:numId w:val="4"/>
         </w:numPr>
       </w:pPr>
-      <w:proofErr w:type="gramStart"/>
-      <w:r>
-        <w:t>annuler</w:t>
-      </w:r>
-      <w:proofErr w:type="gramEnd"/>
-      <w:r>
-        <w:t xml:space="preserve"> une réservation selon certaines règles</w:t>
+      <w:r>
+        <w:t>annuler une réservation selon certaines règles</w:t>
       </w:r>
     </w:p>
     <w:p>
@@ -547,13 +467,8 @@
           <w:numId w:val="5"/>
         </w:numPr>
       </w:pPr>
-      <w:proofErr w:type="gramStart"/>
-      <w:r>
-        <w:t>gérer</w:t>
-      </w:r>
-      <w:proofErr w:type="gramEnd"/>
-      <w:r>
-        <w:t xml:space="preserve"> les films</w:t>
+      <w:r>
+        <w:t>gérer les films</w:t>
       </w:r>
     </w:p>
     <w:p>
@@ -563,13 +478,8 @@
           <w:numId w:val="5"/>
         </w:numPr>
       </w:pPr>
-      <w:proofErr w:type="gramStart"/>
-      <w:r>
-        <w:t>gérer</w:t>
-      </w:r>
-      <w:proofErr w:type="gramEnd"/>
-      <w:r>
-        <w:t xml:space="preserve"> les salles</w:t>
+      <w:r>
+        <w:t>gérer les salles</w:t>
       </w:r>
     </w:p>
     <w:p>
@@ -579,13 +489,8 @@
           <w:numId w:val="5"/>
         </w:numPr>
       </w:pPr>
-      <w:proofErr w:type="gramStart"/>
-      <w:r>
-        <w:t>programmer</w:t>
-      </w:r>
-      <w:proofErr w:type="gramEnd"/>
-      <w:r>
-        <w:t xml:space="preserve"> les séances</w:t>
+      <w:r>
+        <w:t>programmer les séances</w:t>
       </w:r>
     </w:p>
     <w:p>
@@ -595,13 +500,8 @@
           <w:numId w:val="5"/>
         </w:numPr>
       </w:pPr>
-      <w:proofErr w:type="gramStart"/>
-      <w:r>
-        <w:t>consulter</w:t>
-      </w:r>
-      <w:proofErr w:type="gramEnd"/>
-      <w:r>
-        <w:t xml:space="preserve"> les réservations</w:t>
+      <w:r>
+        <w:t>consulter les réservations</w:t>
       </w:r>
     </w:p>
     <w:p>
@@ -611,13 +511,8 @@
           <w:numId w:val="5"/>
         </w:numPr>
       </w:pPr>
-      <w:proofErr w:type="gramStart"/>
-      <w:r>
-        <w:t>changer</w:t>
-      </w:r>
-      <w:proofErr w:type="gramEnd"/>
-      <w:r>
-        <w:t xml:space="preserve"> le statut d’une réservation</w:t>
+      <w:r>
+        <w:t>changer le statut d’une réservation</w:t>
       </w:r>
     </w:p>
     <w:p>
@@ -627,13 +522,8 @@
           <w:numId w:val="5"/>
         </w:numPr>
       </w:pPr>
-      <w:proofErr w:type="gramStart"/>
-      <w:r>
-        <w:t>visualiser</w:t>
-      </w:r>
-      <w:proofErr w:type="gramEnd"/>
-      <w:r>
-        <w:t xml:space="preserve"> les places occupées</w:t>
+      <w:r>
+        <w:t>visualiser les places occupées</w:t>
       </w:r>
     </w:p>
     <w:p>
@@ -658,13 +548,8 @@
           <w:numId w:val="6"/>
         </w:numPr>
       </w:pPr>
-      <w:proofErr w:type="gramStart"/>
-      <w:r>
-        <w:t>gérer</w:t>
-      </w:r>
-      <w:proofErr w:type="gramEnd"/>
-      <w:r>
-        <w:t xml:space="preserve"> les utilisateurs</w:t>
+      <w:r>
+        <w:t>gérer les utilisateurs</w:t>
       </w:r>
     </w:p>
     <w:p>
@@ -674,13 +559,8 @@
           <w:numId w:val="6"/>
         </w:numPr>
       </w:pPr>
-      <w:proofErr w:type="gramStart"/>
-      <w:r>
-        <w:t>gérer</w:t>
-      </w:r>
-      <w:proofErr w:type="gramEnd"/>
-      <w:r>
-        <w:t xml:space="preserve"> les rôles</w:t>
+      <w:r>
+        <w:t>gérer les rôles</w:t>
       </w:r>
     </w:p>
     <w:p>
@@ -690,13 +570,8 @@
           <w:numId w:val="6"/>
         </w:numPr>
       </w:pPr>
-      <w:proofErr w:type="gramStart"/>
-      <w:r>
-        <w:t>consulter</w:t>
-      </w:r>
-      <w:proofErr w:type="gramEnd"/>
-      <w:r>
-        <w:t xml:space="preserve"> des statistiques</w:t>
+      <w:r>
+        <w:t>consulter des statistiques</w:t>
       </w:r>
     </w:p>
     <w:p>
@@ -706,13 +581,8 @@
           <w:numId w:val="6"/>
         </w:numPr>
       </w:pPr>
-      <w:proofErr w:type="gramStart"/>
-      <w:r>
-        <w:t>superviser</w:t>
-      </w:r>
-      <w:proofErr w:type="gramEnd"/>
-      <w:r>
-        <w:t xml:space="preserve"> l’ensemble du système</w:t>
+      <w:r>
+        <w:t>superviser l’ensemble du système</w:t>
       </w:r>
     </w:p>
     <w:p>
@@ -863,13 +733,8 @@
           <w:numId w:val="8"/>
         </w:numPr>
       </w:pPr>
-      <w:proofErr w:type="gramStart"/>
-      <w:r>
-        <w:t>une</w:t>
-      </w:r>
-      <w:proofErr w:type="gramEnd"/>
-      <w:r>
-        <w:t xml:space="preserve"> séance appartient à un seul film</w:t>
+      <w:r>
+        <w:t>une séance appartient à un seul film</w:t>
       </w:r>
     </w:p>
     <w:p>
@@ -879,13 +744,8 @@
           <w:numId w:val="8"/>
         </w:numPr>
       </w:pPr>
-      <w:proofErr w:type="gramStart"/>
-      <w:r>
-        <w:t>une</w:t>
-      </w:r>
-      <w:proofErr w:type="gramEnd"/>
-      <w:r>
-        <w:t xml:space="preserve"> séance se déroule dans une seule salle</w:t>
+      <w:r>
+        <w:t>une séance se déroule dans une seule salle</w:t>
       </w:r>
     </w:p>
     <w:p>
@@ -895,13 +755,8 @@
           <w:numId w:val="8"/>
         </w:numPr>
       </w:pPr>
-      <w:proofErr w:type="gramStart"/>
-      <w:r>
-        <w:t>une</w:t>
-      </w:r>
-      <w:proofErr w:type="gramEnd"/>
-      <w:r>
-        <w:t xml:space="preserve"> place ne peut pas être réservée deux fois pour la même séance</w:t>
+      <w:r>
+        <w:t>une place ne peut pas être réservée deux fois pour la même séance</w:t>
       </w:r>
     </w:p>
     <w:p>
@@ -911,13 +766,8 @@
           <w:numId w:val="8"/>
         </w:numPr>
       </w:pPr>
-      <w:proofErr w:type="gramStart"/>
-      <w:r>
-        <w:t>une</w:t>
-      </w:r>
-      <w:proofErr w:type="gramEnd"/>
-      <w:r>
-        <w:t xml:space="preserve"> réservation doit contenir au moins une place</w:t>
+      <w:r>
+        <w:t>une réservation doit contenir au moins une place</w:t>
       </w:r>
     </w:p>
     <w:p>
@@ -927,13 +777,8 @@
           <w:numId w:val="8"/>
         </w:numPr>
       </w:pPr>
-      <w:proofErr w:type="gramStart"/>
-      <w:r>
-        <w:t>une</w:t>
-      </w:r>
-      <w:proofErr w:type="gramEnd"/>
-      <w:r>
-        <w:t xml:space="preserve"> réservation confirmée génère un billet</w:t>
+      <w:r>
+        <w:t>une réservation confirmée génère un billet</w:t>
       </w:r>
     </w:p>
     <w:p>
@@ -943,13 +788,8 @@
           <w:numId w:val="8"/>
         </w:numPr>
       </w:pPr>
-      <w:proofErr w:type="gramStart"/>
-      <w:r>
-        <w:t>une</w:t>
-      </w:r>
-      <w:proofErr w:type="gramEnd"/>
-      <w:r>
-        <w:t xml:space="preserve"> annulation libère les places</w:t>
+      <w:r>
+        <w:t>une annulation libère les places</w:t>
       </w:r>
     </w:p>
     <w:p>
@@ -959,13 +799,8 @@
           <w:numId w:val="8"/>
         </w:numPr>
       </w:pPr>
-      <w:proofErr w:type="gramStart"/>
-      <w:r>
-        <w:t>un</w:t>
-      </w:r>
-      <w:proofErr w:type="gramEnd"/>
-      <w:r>
-        <w:t xml:space="preserve"> client ne peut consulter que ses propres réservations</w:t>
+      <w:r>
+        <w:t>un client ne peut consulter que ses propres réservations</w:t>
       </w:r>
     </w:p>
     <w:p>
@@ -1019,11 +854,9 @@
           <w:numId w:val="9"/>
         </w:numPr>
       </w:pPr>
-      <w:proofErr w:type="gramStart"/>
       <w:r>
         <w:t>inscription</w:t>
       </w:r>
-      <w:proofErr w:type="gramEnd"/>
     </w:p>
     <w:p>
       <w:pPr>
@@ -1032,11 +865,9 @@
           <w:numId w:val="9"/>
         </w:numPr>
       </w:pPr>
-      <w:proofErr w:type="gramStart"/>
       <w:r>
         <w:t>connexion</w:t>
       </w:r>
-      <w:proofErr w:type="gramEnd"/>
     </w:p>
     <w:p>
       <w:pPr>
@@ -1045,11 +876,9 @@
           <w:numId w:val="9"/>
         </w:numPr>
       </w:pPr>
-      <w:proofErr w:type="gramStart"/>
       <w:r>
         <w:t>déconnexion</w:t>
       </w:r>
-      <w:proofErr w:type="gramEnd"/>
     </w:p>
     <w:p>
       <w:pPr>
@@ -1058,13 +887,8 @@
           <w:numId w:val="9"/>
         </w:numPr>
       </w:pPr>
-      <w:proofErr w:type="gramStart"/>
-      <w:r>
-        <w:t>modification</w:t>
-      </w:r>
-      <w:proofErr w:type="gramEnd"/>
-      <w:r>
-        <w:t xml:space="preserve"> du profil</w:t>
+      <w:r>
+        <w:t>modification du profil</w:t>
       </w:r>
     </w:p>
     <w:p>
@@ -1103,13 +927,8 @@
           <w:numId w:val="10"/>
         </w:numPr>
       </w:pPr>
-      <w:proofErr w:type="gramStart"/>
-      <w:r>
-        <w:t>ajouter</w:t>
-      </w:r>
-      <w:proofErr w:type="gramEnd"/>
-      <w:r>
-        <w:t xml:space="preserve"> un film</w:t>
+      <w:r>
+        <w:t>ajouter un film</w:t>
       </w:r>
     </w:p>
     <w:p>
@@ -1119,13 +938,8 @@
           <w:numId w:val="10"/>
         </w:numPr>
       </w:pPr>
-      <w:proofErr w:type="gramStart"/>
-      <w:r>
-        <w:t>modifier</w:t>
-      </w:r>
-      <w:proofErr w:type="gramEnd"/>
-      <w:r>
-        <w:t xml:space="preserve"> un film</w:t>
+      <w:r>
+        <w:t>modifier un film</w:t>
       </w:r>
     </w:p>
     <w:p>
@@ -1135,13 +949,8 @@
           <w:numId w:val="10"/>
         </w:numPr>
       </w:pPr>
-      <w:proofErr w:type="gramStart"/>
-      <w:r>
-        <w:t>supprimer</w:t>
-      </w:r>
-      <w:proofErr w:type="gramEnd"/>
-      <w:r>
-        <w:t xml:space="preserve"> un film</w:t>
+      <w:r>
+        <w:t>supprimer un film</w:t>
       </w:r>
     </w:p>
     <w:p>
@@ -1151,13 +960,8 @@
           <w:numId w:val="10"/>
         </w:numPr>
       </w:pPr>
-      <w:proofErr w:type="gramStart"/>
-      <w:r>
-        <w:t>afficher</w:t>
-      </w:r>
-      <w:proofErr w:type="gramEnd"/>
-      <w:r>
-        <w:t xml:space="preserve"> l’affiche, le résumé, la durée, le genre, la classification</w:t>
+      <w:r>
+        <w:t>afficher l’affiche, le résumé, la durée, le genre, la classification</w:t>
       </w:r>
     </w:p>
     <w:p>
@@ -1196,13 +1000,8 @@
           <w:numId w:val="11"/>
         </w:numPr>
       </w:pPr>
-      <w:proofErr w:type="gramStart"/>
-      <w:r>
-        <w:t>créer</w:t>
-      </w:r>
-      <w:proofErr w:type="gramEnd"/>
-      <w:r>
-        <w:t xml:space="preserve"> une séance</w:t>
+      <w:r>
+        <w:t>créer une séance</w:t>
       </w:r>
     </w:p>
     <w:p>
@@ -1212,13 +1011,8 @@
           <w:numId w:val="11"/>
         </w:numPr>
       </w:pPr>
-      <w:proofErr w:type="gramStart"/>
-      <w:r>
-        <w:t>associer</w:t>
-      </w:r>
-      <w:proofErr w:type="gramEnd"/>
-      <w:r>
-        <w:t xml:space="preserve"> une salle</w:t>
+      <w:r>
+        <w:t>associer une salle</w:t>
       </w:r>
     </w:p>
     <w:p>
@@ -1228,13 +1022,8 @@
           <w:numId w:val="11"/>
         </w:numPr>
       </w:pPr>
-      <w:proofErr w:type="gramStart"/>
-      <w:r>
-        <w:t>définir</w:t>
-      </w:r>
-      <w:proofErr w:type="gramEnd"/>
-      <w:r>
-        <w:t xml:space="preserve"> la date et l’heure</w:t>
+      <w:r>
+        <w:t>définir la date et l’heure</w:t>
       </w:r>
     </w:p>
     <w:p>
@@ -1244,13 +1033,8 @@
           <w:numId w:val="11"/>
         </w:numPr>
       </w:pPr>
-      <w:proofErr w:type="gramStart"/>
-      <w:r>
-        <w:t>indiquer</w:t>
-      </w:r>
-      <w:proofErr w:type="gramEnd"/>
-      <w:r>
-        <w:t xml:space="preserve"> le prix</w:t>
+      <w:r>
+        <w:t>indiquer le prix</w:t>
       </w:r>
     </w:p>
     <w:p>
@@ -1260,13 +1044,8 @@
           <w:numId w:val="11"/>
         </w:numPr>
       </w:pPr>
-      <w:proofErr w:type="gramStart"/>
-      <w:r>
-        <w:t>calculer</w:t>
-      </w:r>
-      <w:proofErr w:type="gramEnd"/>
-      <w:r>
-        <w:t xml:space="preserve"> automatiquement les places disponibles</w:t>
+      <w:r>
+        <w:t>calculer automatiquement les places disponibles</w:t>
       </w:r>
     </w:p>
     <w:p>
@@ -1305,13 +1084,8 @@
           <w:numId w:val="12"/>
         </w:numPr>
       </w:pPr>
-      <w:proofErr w:type="gramStart"/>
-      <w:r>
-        <w:t>sélection</w:t>
-      </w:r>
-      <w:proofErr w:type="gramEnd"/>
-      <w:r>
-        <w:t xml:space="preserve"> d’une séance</w:t>
+      <w:r>
+        <w:t>sélection d’une séance</w:t>
       </w:r>
     </w:p>
     <w:p>
@@ -1321,14 +1095,9 @@
           <w:numId w:val="12"/>
         </w:numPr>
       </w:pPr>
-      <w:proofErr w:type="gramStart"/>
       <w:r>
         <w:lastRenderedPageBreak/>
-        <w:t>affichage</w:t>
-      </w:r>
-      <w:proofErr w:type="gramEnd"/>
-      <w:r>
-        <w:t xml:space="preserve"> du plan de salle</w:t>
+        <w:t>affichage du plan de salle</w:t>
       </w:r>
     </w:p>
     <w:p>
@@ -1338,13 +1107,8 @@
           <w:numId w:val="12"/>
         </w:numPr>
       </w:pPr>
-      <w:proofErr w:type="gramStart"/>
-      <w:r>
-        <w:t>choix</w:t>
-      </w:r>
-      <w:proofErr w:type="gramEnd"/>
-      <w:r>
-        <w:t xml:space="preserve"> des sièges</w:t>
+      <w:r>
+        <w:t>choix des sièges</w:t>
       </w:r>
     </w:p>
     <w:p>
@@ -1354,13 +1118,8 @@
           <w:numId w:val="12"/>
         </w:numPr>
       </w:pPr>
-      <w:proofErr w:type="gramStart"/>
-      <w:r>
-        <w:t>validation</w:t>
-      </w:r>
-      <w:proofErr w:type="gramEnd"/>
-      <w:r>
-        <w:t xml:space="preserve"> de disponibilité</w:t>
+      <w:r>
+        <w:t>validation de disponibilité</w:t>
       </w:r>
     </w:p>
     <w:p>
@@ -1370,11 +1129,9 @@
           <w:numId w:val="12"/>
         </w:numPr>
       </w:pPr>
-      <w:proofErr w:type="gramStart"/>
       <w:r>
         <w:t>confirmation</w:t>
       </w:r>
-      <w:proofErr w:type="gramEnd"/>
     </w:p>
     <w:p>
       <w:pPr>
@@ -1383,13 +1140,8 @@
           <w:numId w:val="12"/>
         </w:numPr>
       </w:pPr>
-      <w:proofErr w:type="gramStart"/>
-      <w:r>
-        <w:t>création</w:t>
-      </w:r>
-      <w:proofErr w:type="gramEnd"/>
-      <w:r>
-        <w:t xml:space="preserve"> d’une transaction</w:t>
+      <w:r>
+        <w:t>création d’une transaction</w:t>
       </w:r>
     </w:p>
     <w:p>
@@ -1428,13 +1180,8 @@
           <w:numId w:val="13"/>
         </w:numPr>
       </w:pPr>
-      <w:proofErr w:type="gramStart"/>
-      <w:r>
-        <w:t>simulation</w:t>
-      </w:r>
-      <w:proofErr w:type="gramEnd"/>
-      <w:r>
-        <w:t xml:space="preserve"> de paiement</w:t>
+      <w:r>
+        <w:t>simulation de paiement</w:t>
       </w:r>
     </w:p>
     <w:p>
@@ -1444,13 +1191,8 @@
           <w:numId w:val="13"/>
         </w:numPr>
       </w:pPr>
-      <w:proofErr w:type="gramStart"/>
-      <w:r>
-        <w:t>enregistrement</w:t>
-      </w:r>
-      <w:proofErr w:type="gramEnd"/>
-      <w:r>
-        <w:t xml:space="preserve"> du montant</w:t>
+      <w:r>
+        <w:t>enregistrement du montant</w:t>
       </w:r>
     </w:p>
     <w:p>
@@ -1460,13 +1202,8 @@
           <w:numId w:val="13"/>
         </w:numPr>
       </w:pPr>
-      <w:proofErr w:type="gramStart"/>
-      <w:r>
-        <w:t>statut</w:t>
-      </w:r>
-      <w:proofErr w:type="gramEnd"/>
-      <w:r>
-        <w:t xml:space="preserve"> : en attente / payé / annulé</w:t>
+      <w:r>
+        <w:t>statut : en attente / payé / annulé</w:t>
       </w:r>
     </w:p>
     <w:p>
@@ -1505,13 +1242,8 @@
           <w:numId w:val="14"/>
         </w:numPr>
       </w:pPr>
-      <w:proofErr w:type="gramStart"/>
-      <w:r>
-        <w:t>afficher</w:t>
-      </w:r>
-      <w:proofErr w:type="gramEnd"/>
-      <w:r>
-        <w:t xml:space="preserve"> les réservations passées</w:t>
+      <w:r>
+        <w:t>afficher les réservations passées</w:t>
       </w:r>
     </w:p>
     <w:p>
@@ -1521,13 +1253,8 @@
           <w:numId w:val="14"/>
         </w:numPr>
       </w:pPr>
-      <w:proofErr w:type="gramStart"/>
-      <w:r>
-        <w:t>afficher</w:t>
-      </w:r>
-      <w:proofErr w:type="gramEnd"/>
-      <w:r>
-        <w:t xml:space="preserve"> le statut</w:t>
+      <w:r>
+        <w:t>afficher le statut</w:t>
       </w:r>
     </w:p>
     <w:p>
@@ -1537,13 +1264,8 @@
           <w:numId w:val="14"/>
         </w:numPr>
       </w:pPr>
-      <w:proofErr w:type="gramStart"/>
-      <w:r>
-        <w:t>afficher</w:t>
-      </w:r>
-      <w:proofErr w:type="gramEnd"/>
-      <w:r>
-        <w:t xml:space="preserve"> le billet</w:t>
+      <w:r>
+        <w:t>afficher le billet</w:t>
       </w:r>
     </w:p>
     <w:p>
@@ -1568,13 +1290,8 @@
           <w:numId w:val="15"/>
         </w:numPr>
       </w:pPr>
-      <w:proofErr w:type="gramStart"/>
-      <w:r>
-        <w:t>interface</w:t>
-      </w:r>
-      <w:proofErr w:type="gramEnd"/>
-      <w:r>
-        <w:t xml:space="preserve"> simple et claire</w:t>
+      <w:r>
+        <w:t>interface simple et claire</w:t>
       </w:r>
     </w:p>
     <w:p>
@@ -1584,13 +1301,8 @@
           <w:numId w:val="15"/>
         </w:numPr>
       </w:pPr>
-      <w:proofErr w:type="gramStart"/>
-      <w:r>
-        <w:t>temps</w:t>
-      </w:r>
-      <w:proofErr w:type="gramEnd"/>
-      <w:r>
-        <w:t xml:space="preserve"> de réponse acceptable</w:t>
+      <w:r>
+        <w:t>temps de réponse acceptable</w:t>
       </w:r>
     </w:p>
     <w:p>
@@ -1600,13 +1312,8 @@
           <w:numId w:val="15"/>
         </w:numPr>
       </w:pPr>
-      <w:proofErr w:type="gramStart"/>
-      <w:r>
-        <w:t>données</w:t>
-      </w:r>
-      <w:proofErr w:type="gramEnd"/>
-      <w:r>
-        <w:t xml:space="preserve"> validées</w:t>
+      <w:r>
+        <w:t>données validées</w:t>
       </w:r>
     </w:p>
     <w:p>
@@ -1616,13 +1323,8 @@
           <w:numId w:val="15"/>
         </w:numPr>
       </w:pPr>
-      <w:proofErr w:type="gramStart"/>
-      <w:r>
-        <w:t>mot</w:t>
-      </w:r>
-      <w:proofErr w:type="gramEnd"/>
-      <w:r>
-        <w:t xml:space="preserve"> de passe sécurisé</w:t>
+      <w:r>
+        <w:t>mot de passe sécurisé</w:t>
       </w:r>
     </w:p>
     <w:p>
@@ -1632,13 +1334,8 @@
           <w:numId w:val="15"/>
         </w:numPr>
       </w:pPr>
-      <w:proofErr w:type="gramStart"/>
-      <w:r>
-        <w:t>messages</w:t>
-      </w:r>
-      <w:proofErr w:type="gramEnd"/>
-      <w:r>
-        <w:t xml:space="preserve"> d’erreur compréhensibles</w:t>
+      <w:r>
+        <w:t>messages d’erreur compréhensibles</w:t>
       </w:r>
     </w:p>
     <w:p>
@@ -1648,13 +1345,8 @@
           <w:numId w:val="15"/>
         </w:numPr>
       </w:pPr>
-      <w:proofErr w:type="gramStart"/>
-      <w:r>
-        <w:t>application</w:t>
-      </w:r>
-      <w:proofErr w:type="gramEnd"/>
-      <w:r>
-        <w:t xml:space="preserve"> responsive</w:t>
+      <w:r>
+        <w:t>application responsive</w:t>
       </w:r>
     </w:p>
     <w:p/>

</xml_diff>